<commit_message>
Skills de producto ya instaladas en .agents/skills
problem-statement, jobs-to-be-done, prd-development y user-story, de
github.com/deanpeters/Product-Manager-Skills (CC BY-NC-SA 4.0), sin cambios,
para que los alumnos no tengan que descargarlas. LEEME actualizado.

Co-Authored-By: Claude Opus 5.5 <noreply@anthropic.com>
</commit_message>
<xml_diff>
--- a/LEEME.docx
+++ b/LEEME.docx
@@ -208,8 +208,8 @@
         </w:tblBorders>
       </w:tblPr>
       <w:tblGrid>
-        <w:gridCol w:w="1884"/>
-        <w:gridCol w:w="7116"/>
+        <w:gridCol w:w="1676"/>
+        <w:gridCol w:w="7324"/>
       </w:tblGrid>
       <w:tr>
         <w:trPr>
@@ -217,7 +217,7 @@
         </w:trPr>
         <w:tc>
           <w:tcPr>
-            <w:tcW w:type="dxa" w:w="1884"/>
+            <w:tcW w:type="dxa" w:w="1676"/>
             <w:shd w:fill="020857" w:val="clear"/>
             <w:tcMar>
               <w:top w:type="dxa" w:w="60"/>
@@ -243,7 +243,7 @@
         </w:tc>
         <w:tc>
           <w:tcPr>
-            <w:tcW w:type="dxa" w:w="7116"/>
+            <w:tcW w:type="dxa" w:w="7324"/>
             <w:shd w:fill="020857" w:val="clear"/>
             <w:tcMar>
               <w:top w:type="dxa" w:w="60"/>
@@ -271,7 +271,7 @@
       <w:tr>
         <w:tc>
           <w:tcPr>
-            <w:tcW w:type="dxa" w:w="1884"/>
+            <w:tcW w:type="dxa" w:w="1676"/>
             <w:shd w:fill="FFFFFF" w:val="clear"/>
             <w:tcMar>
               <w:top w:type="dxa" w:w="60"/>
@@ -295,7 +295,7 @@
         </w:tc>
         <w:tc>
           <w:tcPr>
-            <w:tcW w:type="dxa" w:w="7116"/>
+            <w:tcW w:type="dxa" w:w="7324"/>
             <w:shd w:fill="FFFFFF" w:val="clear"/>
             <w:tcMar>
               <w:top w:type="dxa" w:w="60"/>
@@ -328,7 +328,7 @@
       <w:tr>
         <w:tc>
           <w:tcPr>
-            <w:tcW w:type="dxa" w:w="1884"/>
+            <w:tcW w:type="dxa" w:w="1676"/>
             <w:shd w:fill="FFFFFF" w:val="clear"/>
             <w:tcMar>
               <w:top w:type="dxa" w:w="60"/>
@@ -366,7 +366,7 @@
         </w:tc>
         <w:tc>
           <w:tcPr>
-            <w:tcW w:type="dxa" w:w="7116"/>
+            <w:tcW w:type="dxa" w:w="7324"/>
             <w:shd w:fill="FFFFFF" w:val="clear"/>
             <w:tcMar>
               <w:top w:type="dxa" w:w="60"/>
@@ -385,6 +385,105 @@
                 <w:color w:val="333333"/>
               </w:rPr>
               <w:t xml:space="preserve">La base técnica: proyecto, login con WK, protección de rutas, empresas y ficha</w:t>
+            </w:r>
+          </w:p>
+        </w:tc>
+      </w:tr>
+      <w:tr>
+        <w:tc>
+          <w:tcPr>
+            <w:tcW w:type="dxa" w:w="1676"/>
+            <w:shd w:fill="FFFFFF" w:val="clear"/>
+            <w:tcMar>
+              <w:top w:type="dxa" w:w="60"/>
+              <w:left w:type="dxa" w:w="120"/>
+              <w:bottom w:type="dxa" w:w="60"/>
+              <w:right w:type="dxa" w:w="120"/>
+            </w:tcMar>
+          </w:tcPr>
+          <w:p>
+            <w:pPr>
+              <w:spacing w:after="60" w:before="60"/>
+            </w:pPr>
+            <w:r>
+              <w:rPr>
+                <w:rFonts w:ascii="Courier New" w:cs="Courier New" w:eastAsia="Courier New" w:hAnsi="Courier New"/>
+                <w:color w:val="333333"/>
+              </w:rPr>
+              <w:t xml:space="preserve">.agents/skills/</w:t>
+            </w:r>
+          </w:p>
+        </w:tc>
+        <w:tc>
+          <w:tcPr>
+            <w:tcW w:type="dxa" w:w="7324"/>
+            <w:shd w:fill="FFFFFF" w:val="clear"/>
+            <w:tcMar>
+              <w:top w:type="dxa" w:w="60"/>
+              <w:left w:type="dxa" w:w="120"/>
+              <w:bottom w:type="dxa" w:w="60"/>
+              <w:right w:type="dxa" w:w="120"/>
+            </w:tcMar>
+          </w:tcPr>
+          <w:p>
+            <w:pPr>
+              <w:spacing w:after="60" w:before="60"/>
+            </w:pPr>
+            <w:r>
+              <w:rPr>
+                <w:rFonts w:ascii="Arial" w:cs="Arial" w:eastAsia="Arial" w:hAnsi="Arial"/>
+                <w:color w:val="333333"/>
+              </w:rPr>
+              <w:t xml:space="preserve">Las cuatro skills de producto, ya instaladas: </w:t>
+            </w:r>
+            <w:r>
+              <w:rPr>
+                <w:rFonts w:ascii="Courier New" w:cs="Courier New" w:eastAsia="Courier New" w:hAnsi="Courier New"/>
+                <w:color w:val="333333"/>
+              </w:rPr>
+              <w:t xml:space="preserve">problem-statement</w:t>
+            </w:r>
+            <w:r>
+              <w:rPr>
+                <w:rFonts w:ascii="Arial" w:cs="Arial" w:eastAsia="Arial" w:hAnsi="Arial"/>
+                <w:color w:val="333333"/>
+              </w:rPr>
+              <w:t xml:space="preserve">, </w:t>
+            </w:r>
+            <w:r>
+              <w:rPr>
+                <w:rFonts w:ascii="Courier New" w:cs="Courier New" w:eastAsia="Courier New" w:hAnsi="Courier New"/>
+                <w:color w:val="333333"/>
+              </w:rPr>
+              <w:t xml:space="preserve">jobs-to-be-done</w:t>
+            </w:r>
+            <w:r>
+              <w:rPr>
+                <w:rFonts w:ascii="Arial" w:cs="Arial" w:eastAsia="Arial" w:hAnsi="Arial"/>
+                <w:color w:val="333333"/>
+              </w:rPr>
+              <w:t xml:space="preserve">, </w:t>
+            </w:r>
+            <w:r>
+              <w:rPr>
+                <w:rFonts w:ascii="Courier New" w:cs="Courier New" w:eastAsia="Courier New" w:hAnsi="Courier New"/>
+                <w:color w:val="333333"/>
+              </w:rPr>
+              <w:t xml:space="preserve">prd-development</w:t>
+            </w:r>
+            <w:r>
+              <w:rPr>
+                <w:rFonts w:ascii="Arial" w:cs="Arial" w:eastAsia="Arial" w:hAnsi="Arial"/>
+                <w:color w:val="333333"/>
+              </w:rPr>
+              <w:t xml:space="preserve"> y </w:t>
+            </w:r>
+            <w:r>
+              <w:rPr>
+                <w:rFonts w:ascii="Courier New" w:cs="Courier New" w:eastAsia="Courier New" w:hAnsi="Courier New"/>
+                <w:color w:val="333333"/>
+              </w:rPr>
+              <w:t xml:space="preserve">user-story</w:t>
             </w:r>
           </w:p>
         </w:tc>

</xml_diff>

<commit_message>
Módulo 4: prompts 06-08 (MCP de Next.js, PRD con skills, funcionalidad) y prompt 01 reutiliza las claves
- api_01 copia las claves de conexion/.env.local si existe (guía de conexión).
- api_06: MCP next-devtools en .vscode/mcp.json (puerto 53971).
- api_07: problema, PRD e historias con las skills de .agents/skills.
- api_08: de una historia a un prompt OpenSpec y a la funcionalidad.
- FICHA: la API responde null sin datos; fecha de baja con hora; curl.exe.

Co-Authored-By: Claude Opus 5.5 <noreply@anthropic.com>
</commit_message>
<xml_diff>
--- a/LEEME.docx
+++ b/LEEME.docx
@@ -384,7 +384,71 @@
                 <w:rFonts w:ascii="Arial" w:cs="Arial" w:eastAsia="Arial" w:hAnsi="Arial"/>
                 <w:color w:val="333333"/>
               </w:rPr>
-              <w:t xml:space="preserve">La base técnica: proyecto, login con WK, protección de rutas, empresas y ficha</w:t>
+              <w:t xml:space="preserve">La base: proyecto, login con WK, protección de las páginas, empresas y ficha</w:t>
+            </w:r>
+          </w:p>
+        </w:tc>
+      </w:tr>
+      <w:tr>
+        <w:tc>
+          <w:tcPr>
+            <w:tcW w:type="dxa" w:w="1676"/>
+            <w:shd w:fill="FFFFFF" w:val="clear"/>
+            <w:tcMar>
+              <w:top w:type="dxa" w:w="60"/>
+              <w:left w:type="dxa" w:w="120"/>
+              <w:bottom w:type="dxa" w:w="60"/>
+              <w:right w:type="dxa" w:w="120"/>
+            </w:tcMar>
+          </w:tcPr>
+          <w:p>
+            <w:pPr>
+              <w:spacing w:after="60" w:before="60"/>
+            </w:pPr>
+            <w:r>
+              <w:rPr>
+                <w:rFonts w:ascii="Courier New" w:cs="Courier New" w:eastAsia="Courier New" w:hAnsi="Courier New"/>
+                <w:color w:val="333333"/>
+              </w:rPr>
+              <w:t xml:space="preserve">prompts/api_06</w:t>
+            </w:r>
+            <w:r>
+              <w:rPr>
+                <w:rFonts w:ascii="Arial" w:cs="Arial" w:eastAsia="Arial" w:hAnsi="Arial"/>
+                <w:color w:val="333333"/>
+              </w:rPr>
+              <w:t xml:space="preserve"> … </w:t>
+            </w:r>
+            <w:r>
+              <w:rPr>
+                <w:rFonts w:ascii="Courier New" w:cs="Courier New" w:eastAsia="Courier New" w:hAnsi="Courier New"/>
+                <w:color w:val="333333"/>
+              </w:rPr>
+              <w:t xml:space="preserve">api_08</w:t>
+            </w:r>
+          </w:p>
+        </w:tc>
+        <w:tc>
+          <w:tcPr>
+            <w:tcW w:type="dxa" w:w="7324"/>
+            <w:shd w:fill="FFFFFF" w:val="clear"/>
+            <w:tcMar>
+              <w:top w:type="dxa" w:w="60"/>
+              <w:left w:type="dxa" w:w="120"/>
+              <w:bottom w:type="dxa" w:w="60"/>
+              <w:right w:type="dxa" w:w="120"/>
+            </w:tcMar>
+          </w:tcPr>
+          <w:p>
+            <w:pPr>
+              <w:spacing w:after="60" w:before="60"/>
+            </w:pPr>
+            <w:r>
+              <w:rPr>
+                <w:rFonts w:ascii="Arial" w:cs="Arial" w:eastAsia="Arial" w:hAnsi="Arial"/>
+                <w:color w:val="333333"/>
+              </w:rPr>
+              <w:t xml:space="preserve">Copilot ve su aplicación (MCP), su PRD con las skills y sus funcionalidades</w:t>
             </w:r>
           </w:p>
         </w:tc>

</xml_diff>

<commit_message>
Módulo 5: plan del día, cuatro ideas, revisión de calidad y rutas de Nómina en la ficha
- api_09 plan del día; api_10-13 ideas (coste mes a mes, comparar, altas y bajas, avisos),
  comprobadas con la API; api_14 revisión de calidad.
- FICHA: rutas de Nómina usadas y campos que no se enseñan nunca.

Co-Authored-By: Claude Opus 5.5 <noreply@anthropic.com>
</commit_message>
<xml_diff>
--- a/LEEME.docx
+++ b/LEEME.docx
@@ -474,6 +474,70 @@
                 <w:rFonts w:ascii="Courier New" w:cs="Courier New" w:eastAsia="Courier New" w:hAnsi="Courier New"/>
                 <w:color w:val="333333"/>
               </w:rPr>
+              <w:t xml:space="preserve">prompts/api_09</w:t>
+            </w:r>
+            <w:r>
+              <w:rPr>
+                <w:rFonts w:ascii="Arial" w:cs="Arial" w:eastAsia="Arial" w:hAnsi="Arial"/>
+                <w:color w:val="333333"/>
+              </w:rPr>
+              <w:t xml:space="preserve"> … </w:t>
+            </w:r>
+            <w:r>
+              <w:rPr>
+                <w:rFonts w:ascii="Courier New" w:cs="Courier New" w:eastAsia="Courier New" w:hAnsi="Courier New"/>
+                <w:color w:val="333333"/>
+              </w:rPr>
+              <w:t xml:space="preserve">api_14</w:t>
+            </w:r>
+          </w:p>
+        </w:tc>
+        <w:tc>
+          <w:tcPr>
+            <w:tcW w:type="dxa" w:w="7324"/>
+            <w:shd w:fill="FFFFFF" w:val="clear"/>
+            <w:tcMar>
+              <w:top w:type="dxa" w:w="60"/>
+              <w:left w:type="dxa" w:w="120"/>
+              <w:bottom w:type="dxa" w:w="60"/>
+              <w:right w:type="dxa" w:w="120"/>
+            </w:tcMar>
+          </w:tcPr>
+          <w:p>
+            <w:pPr>
+              <w:spacing w:after="60" w:before="60"/>
+            </w:pPr>
+            <w:r>
+              <w:rPr>
+                <w:rFonts w:ascii="Arial" w:cs="Arial" w:eastAsia="Arial" w:hAnsi="Arial"/>
+                <w:color w:val="333333"/>
+              </w:rPr>
+              <w:t xml:space="preserve">Módulo 5: el plan del día, cuatro ideas de funcionalidades y la revisión de calidad</w:t>
+            </w:r>
+          </w:p>
+        </w:tc>
+      </w:tr>
+      <w:tr>
+        <w:tc>
+          <w:tcPr>
+            <w:tcW w:type="dxa" w:w="1676"/>
+            <w:shd w:fill="FFFFFF" w:val="clear"/>
+            <w:tcMar>
+              <w:top w:type="dxa" w:w="60"/>
+              <w:left w:type="dxa" w:w="120"/>
+              <w:bottom w:type="dxa" w:w="60"/>
+              <w:right w:type="dxa" w:w="120"/>
+            </w:tcMar>
+          </w:tcPr>
+          <w:p>
+            <w:pPr>
+              <w:spacing w:after="60" w:before="60"/>
+            </w:pPr>
+            <w:r>
+              <w:rPr>
+                <w:rFonts w:ascii="Courier New" w:cs="Courier New" w:eastAsia="Courier New" w:hAnsi="Courier New"/>
+                <w:color w:val="333333"/>
+              </w:rPr>
               <w:t xml:space="preserve">.agents/skills/</w:t>
             </w:r>
           </w:p>

</xml_diff>

<commit_message>
Skill grilling (y su atajo grill-me), de mattpocock/skills
- grilling copiada sin cambios (MIT); grill-me con una línea para Copilot,
  que no tiene la herramienta Skill.
- .agents/skills/LEEME.md y LEEME actualizados.

Co-Authored-By: Claude Opus 5.5 <noreply@anthropic.com>
</commit_message>
<xml_diff>
--- a/LEEME.docx
+++ b/LEEME.docx
@@ -208,8 +208,8 @@
         </w:tblBorders>
       </w:tblPr>
       <w:tblGrid>
-        <w:gridCol w:w="1676"/>
-        <w:gridCol w:w="7324"/>
+        <w:gridCol w:w="1209"/>
+        <w:gridCol w:w="7791"/>
       </w:tblGrid>
       <w:tr>
         <w:trPr>
@@ -217,7 +217,7 @@
         </w:trPr>
         <w:tc>
           <w:tcPr>
-            <w:tcW w:type="dxa" w:w="1676"/>
+            <w:tcW w:type="dxa" w:w="1209"/>
             <w:shd w:fill="020857" w:val="clear"/>
             <w:tcMar>
               <w:top w:type="dxa" w:w="60"/>
@@ -243,7 +243,7 @@
         </w:tc>
         <w:tc>
           <w:tcPr>
-            <w:tcW w:type="dxa" w:w="7324"/>
+            <w:tcW w:type="dxa" w:w="7791"/>
             <w:shd w:fill="020857" w:val="clear"/>
             <w:tcMar>
               <w:top w:type="dxa" w:w="60"/>
@@ -271,7 +271,7 @@
       <w:tr>
         <w:tc>
           <w:tcPr>
-            <w:tcW w:type="dxa" w:w="1676"/>
+            <w:tcW w:type="dxa" w:w="1209"/>
             <w:shd w:fill="FFFFFF" w:val="clear"/>
             <w:tcMar>
               <w:top w:type="dxa" w:w="60"/>
@@ -295,7 +295,7 @@
         </w:tc>
         <w:tc>
           <w:tcPr>
-            <w:tcW w:type="dxa" w:w="7324"/>
+            <w:tcW w:type="dxa" w:w="7791"/>
             <w:shd w:fill="FFFFFF" w:val="clear"/>
             <w:tcMar>
               <w:top w:type="dxa" w:w="60"/>
@@ -328,7 +328,7 @@
       <w:tr>
         <w:tc>
           <w:tcPr>
-            <w:tcW w:type="dxa" w:w="1676"/>
+            <w:tcW w:type="dxa" w:w="1209"/>
             <w:shd w:fill="FFFFFF" w:val="clear"/>
             <w:tcMar>
               <w:top w:type="dxa" w:w="60"/>
@@ -366,7 +366,7 @@
         </w:tc>
         <w:tc>
           <w:tcPr>
-            <w:tcW w:type="dxa" w:w="7324"/>
+            <w:tcW w:type="dxa" w:w="7791"/>
             <w:shd w:fill="FFFFFF" w:val="clear"/>
             <w:tcMar>
               <w:top w:type="dxa" w:w="60"/>
@@ -392,7 +392,7 @@
       <w:tr>
         <w:tc>
           <w:tcPr>
-            <w:tcW w:type="dxa" w:w="1676"/>
+            <w:tcW w:type="dxa" w:w="1209"/>
             <w:shd w:fill="FFFFFF" w:val="clear"/>
             <w:tcMar>
               <w:top w:type="dxa" w:w="60"/>
@@ -430,7 +430,7 @@
         </w:tc>
         <w:tc>
           <w:tcPr>
-            <w:tcW w:type="dxa" w:w="7324"/>
+            <w:tcW w:type="dxa" w:w="7791"/>
             <w:shd w:fill="FFFFFF" w:val="clear"/>
             <w:tcMar>
               <w:top w:type="dxa" w:w="60"/>
@@ -456,7 +456,7 @@
       <w:tr>
         <w:tc>
           <w:tcPr>
-            <w:tcW w:type="dxa" w:w="1676"/>
+            <w:tcW w:type="dxa" w:w="1209"/>
             <w:shd w:fill="FFFFFF" w:val="clear"/>
             <w:tcMar>
               <w:top w:type="dxa" w:w="60"/>
@@ -494,7 +494,7 @@
         </w:tc>
         <w:tc>
           <w:tcPr>
-            <w:tcW w:type="dxa" w:w="7324"/>
+            <w:tcW w:type="dxa" w:w="7791"/>
             <w:shd w:fill="FFFFFF" w:val="clear"/>
             <w:tcMar>
               <w:top w:type="dxa" w:w="60"/>
@@ -520,7 +520,7 @@
       <w:tr>
         <w:tc>
           <w:tcPr>
-            <w:tcW w:type="dxa" w:w="1676"/>
+            <w:tcW w:type="dxa" w:w="1209"/>
             <w:shd w:fill="FFFFFF" w:val="clear"/>
             <w:tcMar>
               <w:top w:type="dxa" w:w="60"/>
@@ -544,7 +544,7 @@
         </w:tc>
         <w:tc>
           <w:tcPr>
-            <w:tcW w:type="dxa" w:w="7324"/>
+            <w:tcW w:type="dxa" w:w="7791"/>
             <w:shd w:fill="FFFFFF" w:val="clear"/>
             <w:tcMar>
               <w:top w:type="dxa" w:w="60"/>
@@ -562,7 +562,7 @@
                 <w:rFonts w:ascii="Arial" w:cs="Arial" w:eastAsia="Arial" w:hAnsi="Arial"/>
                 <w:color w:val="333333"/>
               </w:rPr>
-              <w:t xml:space="preserve">Las cuatro skills de producto, ya instaladas: </w:t>
+              <w:t xml:space="preserve">Skills ya instaladas: las cuatro de producto (</w:t>
             </w:r>
             <w:r>
               <w:rPr>
@@ -604,7 +604,7 @@
                 <w:rFonts w:ascii="Arial" w:cs="Arial" w:eastAsia="Arial" w:hAnsi="Arial"/>
                 <w:color w:val="333333"/>
               </w:rPr>
-              <w:t xml:space="preserve"> y </w:t>
+              <w:t xml:space="preserve">, </w:t>
             </w:r>
             <w:r>
               <w:rPr>
@@ -612,6 +612,41 @@
                 <w:color w:val="333333"/>
               </w:rPr>
               <w:t xml:space="preserve">user-story</w:t>
+            </w:r>
+            <w:r>
+              <w:rPr>
+                <w:rFonts w:ascii="Arial" w:cs="Arial" w:eastAsia="Arial" w:hAnsi="Arial"/>
+                <w:color w:val="333333"/>
+              </w:rPr>
+              <w:t xml:space="preserve">) y </w:t>
+            </w:r>
+            <w:r>
+              <w:rPr>
+                <w:rFonts w:ascii="Courier New" w:cs="Courier New" w:eastAsia="Courier New" w:hAnsi="Courier New"/>
+                <w:color w:val="333333"/>
+              </w:rPr>
+              <w:t xml:space="preserve">grilling</w:t>
+            </w:r>
+            <w:r>
+              <w:rPr>
+                <w:rFonts w:ascii="Arial" w:cs="Arial" w:eastAsia="Arial" w:hAnsi="Arial"/>
+                <w:color w:val="333333"/>
+              </w:rPr>
+              <w:t xml:space="preserve"> / </w:t>
+            </w:r>
+            <w:r>
+              <w:rPr>
+                <w:rFonts w:ascii="Courier New" w:cs="Courier New" w:eastAsia="Courier New" w:hAnsi="Courier New"/>
+                <w:color w:val="333333"/>
+              </w:rPr>
+              <w:t xml:space="preserve">grill-me</w:t>
+            </w:r>
+            <w:r>
+              <w:rPr>
+                <w:rFonts w:ascii="Arial" w:cs="Arial" w:eastAsia="Arial" w:hAnsi="Arial"/>
+                <w:color w:val="333333"/>
+              </w:rPr>
+              <w:t xml:space="preserve">, para poner a prueba una idea</w:t>
             </w:r>
           </w:p>
         </w:tc>

</xml_diff>

<commit_message>
Skill wk-api-nomina: las 189 lecturas de la API de Nómina, con sus campos
- SKILL.md: conexión, cabeceras, reglas del curso, trampas comprobadas, cómo buscar.
- reference/endpoints.md y schemas.md, generados de la OpenAPI oficial (a3developers).
- FICHA: pageSize máximo 50 y leer todas las páginas (la API corta a los 300); filter/orderBy.
- Ideas del Módulo 5: cifras corregidas (COMERCIO BARCELONA estaba cortada a 200).

Co-Authored-By: Claude Opus 5.5 <noreply@anthropic.com>
</commit_message>
<xml_diff>
--- a/LEEME.docx
+++ b/LEEME.docx
@@ -208,8 +208,8 @@
         </w:tblBorders>
       </w:tblPr>
       <w:tblGrid>
-        <w:gridCol w:w="1209"/>
-        <w:gridCol w:w="7791"/>
+        <w:gridCol w:w="927"/>
+        <w:gridCol w:w="8073"/>
       </w:tblGrid>
       <w:tr>
         <w:trPr>
@@ -217,7 +217,7 @@
         </w:trPr>
         <w:tc>
           <w:tcPr>
-            <w:tcW w:type="dxa" w:w="1209"/>
+            <w:tcW w:type="dxa" w:w="927"/>
             <w:shd w:fill="020857" w:val="clear"/>
             <w:tcMar>
               <w:top w:type="dxa" w:w="60"/>
@@ -243,7 +243,7 @@
         </w:tc>
         <w:tc>
           <w:tcPr>
-            <w:tcW w:type="dxa" w:w="7791"/>
+            <w:tcW w:type="dxa" w:w="8073"/>
             <w:shd w:fill="020857" w:val="clear"/>
             <w:tcMar>
               <w:top w:type="dxa" w:w="60"/>
@@ -271,7 +271,7 @@
       <w:tr>
         <w:tc>
           <w:tcPr>
-            <w:tcW w:type="dxa" w:w="1209"/>
+            <w:tcW w:type="dxa" w:w="927"/>
             <w:shd w:fill="FFFFFF" w:val="clear"/>
             <w:tcMar>
               <w:top w:type="dxa" w:w="60"/>
@@ -295,7 +295,7 @@
         </w:tc>
         <w:tc>
           <w:tcPr>
-            <w:tcW w:type="dxa" w:w="7791"/>
+            <w:tcW w:type="dxa" w:w="8073"/>
             <w:shd w:fill="FFFFFF" w:val="clear"/>
             <w:tcMar>
               <w:top w:type="dxa" w:w="60"/>
@@ -328,7 +328,7 @@
       <w:tr>
         <w:tc>
           <w:tcPr>
-            <w:tcW w:type="dxa" w:w="1209"/>
+            <w:tcW w:type="dxa" w:w="927"/>
             <w:shd w:fill="FFFFFF" w:val="clear"/>
             <w:tcMar>
               <w:top w:type="dxa" w:w="60"/>
@@ -366,7 +366,7 @@
         </w:tc>
         <w:tc>
           <w:tcPr>
-            <w:tcW w:type="dxa" w:w="7791"/>
+            <w:tcW w:type="dxa" w:w="8073"/>
             <w:shd w:fill="FFFFFF" w:val="clear"/>
             <w:tcMar>
               <w:top w:type="dxa" w:w="60"/>
@@ -392,7 +392,7 @@
       <w:tr>
         <w:tc>
           <w:tcPr>
-            <w:tcW w:type="dxa" w:w="1209"/>
+            <w:tcW w:type="dxa" w:w="927"/>
             <w:shd w:fill="FFFFFF" w:val="clear"/>
             <w:tcMar>
               <w:top w:type="dxa" w:w="60"/>
@@ -430,7 +430,7 @@
         </w:tc>
         <w:tc>
           <w:tcPr>
-            <w:tcW w:type="dxa" w:w="7791"/>
+            <w:tcW w:type="dxa" w:w="8073"/>
             <w:shd w:fill="FFFFFF" w:val="clear"/>
             <w:tcMar>
               <w:top w:type="dxa" w:w="60"/>
@@ -456,7 +456,7 @@
       <w:tr>
         <w:tc>
           <w:tcPr>
-            <w:tcW w:type="dxa" w:w="1209"/>
+            <w:tcW w:type="dxa" w:w="927"/>
             <w:shd w:fill="FFFFFF" w:val="clear"/>
             <w:tcMar>
               <w:top w:type="dxa" w:w="60"/>
@@ -494,7 +494,7 @@
         </w:tc>
         <w:tc>
           <w:tcPr>
-            <w:tcW w:type="dxa" w:w="7791"/>
+            <w:tcW w:type="dxa" w:w="8073"/>
             <w:shd w:fill="FFFFFF" w:val="clear"/>
             <w:tcMar>
               <w:top w:type="dxa" w:w="60"/>
@@ -520,7 +520,7 @@
       <w:tr>
         <w:tc>
           <w:tcPr>
-            <w:tcW w:type="dxa" w:w="1209"/>
+            <w:tcW w:type="dxa" w:w="927"/>
             <w:shd w:fill="FFFFFF" w:val="clear"/>
             <w:tcMar>
               <w:top w:type="dxa" w:w="60"/>
@@ -544,7 +544,7 @@
         </w:tc>
         <w:tc>
           <w:tcPr>
-            <w:tcW w:type="dxa" w:w="7791"/>
+            <w:tcW w:type="dxa" w:w="8073"/>
             <w:shd w:fill="FFFFFF" w:val="clear"/>
             <w:tcMar>
               <w:top w:type="dxa" w:w="60"/>
@@ -618,7 +618,7 @@
                 <w:rFonts w:ascii="Arial" w:cs="Arial" w:eastAsia="Arial" w:hAnsi="Arial"/>
                 <w:color w:val="333333"/>
               </w:rPr>
-              <w:t xml:space="preserve">) y </w:t>
+              <w:t xml:space="preserve">) </w:t>
             </w:r>
             <w:r>
               <w:rPr>
@@ -646,7 +646,21 @@
                 <w:rFonts w:ascii="Arial" w:cs="Arial" w:eastAsia="Arial" w:hAnsi="Arial"/>
                 <w:color w:val="333333"/>
               </w:rPr>
-              <w:t xml:space="preserve">, para poner a prueba una idea</w:t>
+              <w:t xml:space="preserve">, para poner a prueba una idea, y </w:t>
+            </w:r>
+            <w:r>
+              <w:rPr>
+                <w:rFonts w:ascii="Courier New" w:cs="Courier New" w:eastAsia="Courier New" w:hAnsi="Courier New"/>
+                <w:color w:val="333333"/>
+              </w:rPr>
+              <w:t xml:space="preserve">wk-api-nomina</w:t>
+            </w:r>
+            <w:r>
+              <w:rPr>
+                <w:rFonts w:ascii="Arial" w:cs="Arial" w:eastAsia="Arial" w:hAnsi="Arial"/>
+                <w:color w:val="333333"/>
+              </w:rPr>
+              <w:t xml:space="preserve">, con todas las lecturas de la API de Nómina</w:t>
             </w:r>
           </w:p>
         </w:tc>

</xml_diff>

<commit_message>
Quitar las reglas «solo datos agregados» y «claves nunca a la vista»
Los datos son inventados: se pueden usar todos, también los de personas.
Queda la regla de solo lectura. Prompts, ficha, LEEME y skill actualizados.

Co-Authored-By: Claude Opus 5.5 <noreply@anthropic.com>
</commit_message>
<xml_diff>
--- a/LEEME.docx
+++ b/LEEME.docx
@@ -756,14 +756,14 @@
           <w:bCs/>
           <w:color w:val="333333"/>
         </w:rPr>
-        <w:t xml:space="preserve">Solo datos agregados en pantalla:</w:t>
-      </w:r>
-      <w:r>
-        <w:rPr>
-          <w:rFonts w:ascii="Arial" w:cs="Arial" w:eastAsia="Arial" w:hAnsi="Arial"/>
-          <w:color w:val="333333"/>
-        </w:rPr>
-        <w:t xml:space="preserve"> nunca nombres, DNI ni importes de personas concretas.</w:t>
+        <w:t xml:space="preserve">Las credenciales van en `.env.local`</w:t>
+      </w:r>
+      <w:r>
+        <w:rPr>
+          <w:rFonts w:ascii="Arial" w:cs="Arial" w:eastAsia="Arial" w:hAnsi="Arial"/>
+          <w:color w:val="333333"/>
+        </w:rPr>
+        <w:t xml:space="preserve">, que no se sube a GitHub.</w:t>
       </w:r>
     </w:p>
     <w:p>
@@ -782,14 +782,14 @@
           <w:bCs/>
           <w:color w:val="333333"/>
         </w:rPr>
-        <w:t xml:space="preserve">Las credenciales solo en `producto-wk/.env.local`:</w:t>
-      </w:r>
-      <w:r>
-        <w:rPr>
-          <w:rFonts w:ascii="Arial" w:cs="Arial" w:eastAsia="Arial" w:hAnsi="Arial"/>
-          <w:color w:val="333333"/>
-        </w:rPr>
-        <w:t xml:space="preserve"> nunca en el código, en GitHub ni en la chat.</w:t>
+        <w:t xml:space="preserve">Los datos son inventados:</w:t>
+      </w:r>
+      <w:r>
+        <w:rPr>
+          <w:rFonts w:ascii="Arial" w:cs="Arial" w:eastAsia="Arial" w:hAnsi="Arial"/>
+          <w:color w:val="333333"/>
+        </w:rPr>
+        <w:t xml:space="preserve"> se pueden usar todos, también los de personas.</w:t>
       </w:r>
     </w:p>
     <w:sectPr>

</xml_diff>

<commit_message>
Skills wk-api-a3factura y wk-api-contabilidad (de la OpenAPI oficial, sin probar)
- a3factura: login propio (mail y contraseña), api-version 2.0, 267 lecturas.
- Contabilidad: login de WK, cabecera context por empresa, 36 lecturas.
- Referencias regeneradas: los tipos «lista de» enlazan a sus campos.

Co-Authored-By: Claude Opus 5.5 <noreply@anthropic.com>
</commit_message>
<xml_diff>
--- a/LEEME.docx
+++ b/LEEME.docx
@@ -208,8 +208,8 @@
         </w:tblBorders>
       </w:tblPr>
       <w:tblGrid>
-        <w:gridCol w:w="927"/>
-        <w:gridCol w:w="8073"/>
+        <w:gridCol w:w="856"/>
+        <w:gridCol w:w="8144"/>
       </w:tblGrid>
       <w:tr>
         <w:trPr>
@@ -217,7 +217,7 @@
         </w:trPr>
         <w:tc>
           <w:tcPr>
-            <w:tcW w:type="dxa" w:w="927"/>
+            <w:tcW w:type="dxa" w:w="856"/>
             <w:shd w:fill="020857" w:val="clear"/>
             <w:tcMar>
               <w:top w:type="dxa" w:w="60"/>
@@ -243,7 +243,7 @@
         </w:tc>
         <w:tc>
           <w:tcPr>
-            <w:tcW w:type="dxa" w:w="8073"/>
+            <w:tcW w:type="dxa" w:w="8144"/>
             <w:shd w:fill="020857" w:val="clear"/>
             <w:tcMar>
               <w:top w:type="dxa" w:w="60"/>
@@ -271,7 +271,7 @@
       <w:tr>
         <w:tc>
           <w:tcPr>
-            <w:tcW w:type="dxa" w:w="927"/>
+            <w:tcW w:type="dxa" w:w="856"/>
             <w:shd w:fill="FFFFFF" w:val="clear"/>
             <w:tcMar>
               <w:top w:type="dxa" w:w="60"/>
@@ -295,7 +295,7 @@
         </w:tc>
         <w:tc>
           <w:tcPr>
-            <w:tcW w:type="dxa" w:w="8073"/>
+            <w:tcW w:type="dxa" w:w="8144"/>
             <w:shd w:fill="FFFFFF" w:val="clear"/>
             <w:tcMar>
               <w:top w:type="dxa" w:w="60"/>
@@ -328,7 +328,7 @@
       <w:tr>
         <w:tc>
           <w:tcPr>
-            <w:tcW w:type="dxa" w:w="927"/>
+            <w:tcW w:type="dxa" w:w="856"/>
             <w:shd w:fill="FFFFFF" w:val="clear"/>
             <w:tcMar>
               <w:top w:type="dxa" w:w="60"/>
@@ -366,7 +366,7 @@
         </w:tc>
         <w:tc>
           <w:tcPr>
-            <w:tcW w:type="dxa" w:w="8073"/>
+            <w:tcW w:type="dxa" w:w="8144"/>
             <w:shd w:fill="FFFFFF" w:val="clear"/>
             <w:tcMar>
               <w:top w:type="dxa" w:w="60"/>
@@ -392,7 +392,7 @@
       <w:tr>
         <w:tc>
           <w:tcPr>
-            <w:tcW w:type="dxa" w:w="927"/>
+            <w:tcW w:type="dxa" w:w="856"/>
             <w:shd w:fill="FFFFFF" w:val="clear"/>
             <w:tcMar>
               <w:top w:type="dxa" w:w="60"/>
@@ -430,7 +430,7 @@
         </w:tc>
         <w:tc>
           <w:tcPr>
-            <w:tcW w:type="dxa" w:w="8073"/>
+            <w:tcW w:type="dxa" w:w="8144"/>
             <w:shd w:fill="FFFFFF" w:val="clear"/>
             <w:tcMar>
               <w:top w:type="dxa" w:w="60"/>
@@ -456,7 +456,7 @@
       <w:tr>
         <w:tc>
           <w:tcPr>
-            <w:tcW w:type="dxa" w:w="927"/>
+            <w:tcW w:type="dxa" w:w="856"/>
             <w:shd w:fill="FFFFFF" w:val="clear"/>
             <w:tcMar>
               <w:top w:type="dxa" w:w="60"/>
@@ -494,7 +494,7 @@
         </w:tc>
         <w:tc>
           <w:tcPr>
-            <w:tcW w:type="dxa" w:w="8073"/>
+            <w:tcW w:type="dxa" w:w="8144"/>
             <w:shd w:fill="FFFFFF" w:val="clear"/>
             <w:tcMar>
               <w:top w:type="dxa" w:w="60"/>
@@ -520,7 +520,7 @@
       <w:tr>
         <w:tc>
           <w:tcPr>
-            <w:tcW w:type="dxa" w:w="927"/>
+            <w:tcW w:type="dxa" w:w="856"/>
             <w:shd w:fill="FFFFFF" w:val="clear"/>
             <w:tcMar>
               <w:top w:type="dxa" w:w="60"/>
@@ -544,7 +544,7 @@
         </w:tc>
         <w:tc>
           <w:tcPr>
-            <w:tcW w:type="dxa" w:w="8073"/>
+            <w:tcW w:type="dxa" w:w="8144"/>
             <w:shd w:fill="FFFFFF" w:val="clear"/>
             <w:tcMar>
               <w:top w:type="dxa" w:w="60"/>
@@ -646,7 +646,7 @@
                 <w:rFonts w:ascii="Arial" w:cs="Arial" w:eastAsia="Arial" w:hAnsi="Arial"/>
                 <w:color w:val="333333"/>
               </w:rPr>
-              <w:t xml:space="preserve">, para poner a prueba una idea, y </w:t>
+              <w:t xml:space="preserve">, para poner a prueba una idea, y las de las API de WK: </w:t>
             </w:r>
             <w:r>
               <w:rPr>
@@ -660,7 +660,28 @@
                 <w:rFonts w:ascii="Arial" w:cs="Arial" w:eastAsia="Arial" w:hAnsi="Arial"/>
                 <w:color w:val="333333"/>
               </w:rPr>
-              <w:t xml:space="preserve">, con todas las lecturas de la API de Nómina</w:t>
+              <w:t xml:space="preserve">, </w:t>
+            </w:r>
+            <w:r>
+              <w:rPr>
+                <w:rFonts w:ascii="Courier New" w:cs="Courier New" w:eastAsia="Courier New" w:hAnsi="Courier New"/>
+                <w:color w:val="333333"/>
+              </w:rPr>
+              <w:t xml:space="preserve">wk-api-a3factura</w:t>
+            </w:r>
+            <w:r>
+              <w:rPr>
+                <w:rFonts w:ascii="Arial" w:cs="Arial" w:eastAsia="Arial" w:hAnsi="Arial"/>
+                <w:color w:val="333333"/>
+              </w:rPr>
+              <w:t xml:space="preserve"> y </w:t>
+            </w:r>
+            <w:r>
+              <w:rPr>
+                <w:rFonts w:ascii="Courier New" w:cs="Courier New" w:eastAsia="Courier New" w:hAnsi="Courier New"/>
+                <w:color w:val="333333"/>
+              </w:rPr>
+              <w:t xml:space="preserve">wk-api-contabilidad</w:t>
             </w:r>
           </w:p>
         </w:tc>

</xml_diff>

<commit_message>
Reglas de trabajo de Copilot en .github/copilot-instructions.md
- Hacer solo lo que pide el prompt, parar si algo falla dos veces, no
  arrancar la aplicación, solo lecturas, curl.exe.
- En «Qué NO debe hacer» de los prompts 02-05, 08 y 10-13: no cambiar nada
  que el prompt no pida.
- LEEME: el archivo nuevo, en la tabla.

Co-Authored-By: Claude Opus 5.5 <noreply@anthropic.com>
</commit_message>
<xml_diff>
--- a/LEEME.docx
+++ b/LEEME.docx
@@ -208,8 +208,8 @@
         </w:tblBorders>
       </w:tblPr>
       <w:tblGrid>
-        <w:gridCol w:w="856"/>
-        <w:gridCol w:w="8144"/>
+        <w:gridCol w:w="1024"/>
+        <w:gridCol w:w="7976"/>
       </w:tblGrid>
       <w:tr>
         <w:trPr>
@@ -217,7 +217,7 @@
         </w:trPr>
         <w:tc>
           <w:tcPr>
-            <w:tcW w:type="dxa" w:w="856"/>
+            <w:tcW w:type="dxa" w:w="1024"/>
             <w:shd w:fill="020857" w:val="clear"/>
             <w:tcMar>
               <w:top w:type="dxa" w:w="60"/>
@@ -243,7 +243,7 @@
         </w:tc>
         <w:tc>
           <w:tcPr>
-            <w:tcW w:type="dxa" w:w="8144"/>
+            <w:tcW w:type="dxa" w:w="7976"/>
             <w:shd w:fill="020857" w:val="clear"/>
             <w:tcMar>
               <w:top w:type="dxa" w:w="60"/>
@@ -271,7 +271,7 @@
       <w:tr>
         <w:tc>
           <w:tcPr>
-            <w:tcW w:type="dxa" w:w="856"/>
+            <w:tcW w:type="dxa" w:w="1024"/>
             <w:shd w:fill="FFFFFF" w:val="clear"/>
             <w:tcMar>
               <w:top w:type="dxa" w:w="60"/>
@@ -295,7 +295,7 @@
         </w:tc>
         <w:tc>
           <w:tcPr>
-            <w:tcW w:type="dxa" w:w="8144"/>
+            <w:tcW w:type="dxa" w:w="7976"/>
             <w:shd w:fill="FFFFFF" w:val="clear"/>
             <w:tcMar>
               <w:top w:type="dxa" w:w="60"/>
@@ -328,7 +328,7 @@
       <w:tr>
         <w:tc>
           <w:tcPr>
-            <w:tcW w:type="dxa" w:w="856"/>
+            <w:tcW w:type="dxa" w:w="1024"/>
             <w:shd w:fill="FFFFFF" w:val="clear"/>
             <w:tcMar>
               <w:top w:type="dxa" w:w="60"/>
@@ -346,27 +346,13 @@
                 <w:rFonts w:ascii="Courier New" w:cs="Courier New" w:eastAsia="Courier New" w:hAnsi="Courier New"/>
                 <w:color w:val="333333"/>
               </w:rPr>
-              <w:t xml:space="preserve">prompts/api_01</w:t>
-            </w:r>
-            <w:r>
-              <w:rPr>
-                <w:rFonts w:ascii="Arial" w:cs="Arial" w:eastAsia="Arial" w:hAnsi="Arial"/>
-                <w:color w:val="333333"/>
-              </w:rPr>
-              <w:t xml:space="preserve"> … </w:t>
-            </w:r>
-            <w:r>
-              <w:rPr>
-                <w:rFonts w:ascii="Courier New" w:cs="Courier New" w:eastAsia="Courier New" w:hAnsi="Courier New"/>
-                <w:color w:val="333333"/>
-              </w:rPr>
-              <w:t xml:space="preserve">api_05</w:t>
-            </w:r>
-          </w:p>
-        </w:tc>
-        <w:tc>
-          <w:tcPr>
-            <w:tcW w:type="dxa" w:w="8144"/>
+              <w:t xml:space="preserve">.github/copilot-instructions.md</w:t>
+            </w:r>
+          </w:p>
+        </w:tc>
+        <w:tc>
+          <w:tcPr>
+            <w:tcW w:type="dxa" w:w="7976"/>
             <w:shd w:fill="FFFFFF" w:val="clear"/>
             <w:tcMar>
               <w:top w:type="dxa" w:w="60"/>
@@ -384,7 +370,7 @@
                 <w:rFonts w:ascii="Arial" w:cs="Arial" w:eastAsia="Arial" w:hAnsi="Arial"/>
                 <w:color w:val="333333"/>
               </w:rPr>
-              <w:t xml:space="preserve">La base: proyecto, login con WK, protección de las páginas, empresas y ficha</w:t>
+              <w:t xml:space="preserve">Las reglas de trabajo de Copilot (hacer solo lo que pide el prompt, parar si algo falla dos veces…). Copilot las lee solo, en cada mensaje</w:t>
             </w:r>
           </w:p>
         </w:tc>
@@ -392,7 +378,7 @@
       <w:tr>
         <w:tc>
           <w:tcPr>
-            <w:tcW w:type="dxa" w:w="856"/>
+            <w:tcW w:type="dxa" w:w="1024"/>
             <w:shd w:fill="FFFFFF" w:val="clear"/>
             <w:tcMar>
               <w:top w:type="dxa" w:w="60"/>
@@ -410,7 +396,7 @@
                 <w:rFonts w:ascii="Courier New" w:cs="Courier New" w:eastAsia="Courier New" w:hAnsi="Courier New"/>
                 <w:color w:val="333333"/>
               </w:rPr>
-              <w:t xml:space="preserve">prompts/api_06</w:t>
+              <w:t xml:space="preserve">prompts/api_01</w:t>
             </w:r>
             <w:r>
               <w:rPr>
@@ -424,13 +410,13 @@
                 <w:rFonts w:ascii="Courier New" w:cs="Courier New" w:eastAsia="Courier New" w:hAnsi="Courier New"/>
                 <w:color w:val="333333"/>
               </w:rPr>
-              <w:t xml:space="preserve">api_08</w:t>
-            </w:r>
-          </w:p>
-        </w:tc>
-        <w:tc>
-          <w:tcPr>
-            <w:tcW w:type="dxa" w:w="8144"/>
+              <w:t xml:space="preserve">api_05</w:t>
+            </w:r>
+          </w:p>
+        </w:tc>
+        <w:tc>
+          <w:tcPr>
+            <w:tcW w:type="dxa" w:w="7976"/>
             <w:shd w:fill="FFFFFF" w:val="clear"/>
             <w:tcMar>
               <w:top w:type="dxa" w:w="60"/>
@@ -448,7 +434,7 @@
                 <w:rFonts w:ascii="Arial" w:cs="Arial" w:eastAsia="Arial" w:hAnsi="Arial"/>
                 <w:color w:val="333333"/>
               </w:rPr>
-              <w:t xml:space="preserve">Copilot ve su aplicación (MCP), su PRD con las skills y sus funcionalidades</w:t>
+              <w:t xml:space="preserve">La base: proyecto, login con WK, protección de las páginas, empresas y ficha</w:t>
             </w:r>
           </w:p>
         </w:tc>
@@ -456,7 +442,7 @@
       <w:tr>
         <w:tc>
           <w:tcPr>
-            <w:tcW w:type="dxa" w:w="856"/>
+            <w:tcW w:type="dxa" w:w="1024"/>
             <w:shd w:fill="FFFFFF" w:val="clear"/>
             <w:tcMar>
               <w:top w:type="dxa" w:w="60"/>
@@ -474,7 +460,7 @@
                 <w:rFonts w:ascii="Courier New" w:cs="Courier New" w:eastAsia="Courier New" w:hAnsi="Courier New"/>
                 <w:color w:val="333333"/>
               </w:rPr>
-              <w:t xml:space="preserve">prompts/api_09</w:t>
+              <w:t xml:space="preserve">prompts/api_06</w:t>
             </w:r>
             <w:r>
               <w:rPr>
@@ -488,13 +474,13 @@
                 <w:rFonts w:ascii="Courier New" w:cs="Courier New" w:eastAsia="Courier New" w:hAnsi="Courier New"/>
                 <w:color w:val="333333"/>
               </w:rPr>
-              <w:t xml:space="preserve">api_14</w:t>
-            </w:r>
-          </w:p>
-        </w:tc>
-        <w:tc>
-          <w:tcPr>
-            <w:tcW w:type="dxa" w:w="8144"/>
+              <w:t xml:space="preserve">api_08</w:t>
+            </w:r>
+          </w:p>
+        </w:tc>
+        <w:tc>
+          <w:tcPr>
+            <w:tcW w:type="dxa" w:w="7976"/>
             <w:shd w:fill="FFFFFF" w:val="clear"/>
             <w:tcMar>
               <w:top w:type="dxa" w:w="60"/>
@@ -512,7 +498,7 @@
                 <w:rFonts w:ascii="Arial" w:cs="Arial" w:eastAsia="Arial" w:hAnsi="Arial"/>
                 <w:color w:val="333333"/>
               </w:rPr>
-              <w:t xml:space="preserve">Módulo 5: el plan del día, cuatro ideas de funcionalidades y la revisión de calidad</w:t>
+              <w:t xml:space="preserve">Copilot ve su aplicación (MCP), su PRD con las skills y sus funcionalidades</w:t>
             </w:r>
           </w:p>
         </w:tc>
@@ -520,7 +506,7 @@
       <w:tr>
         <w:tc>
           <w:tcPr>
-            <w:tcW w:type="dxa" w:w="856"/>
+            <w:tcW w:type="dxa" w:w="1024"/>
             <w:shd w:fill="FFFFFF" w:val="clear"/>
             <w:tcMar>
               <w:top w:type="dxa" w:w="60"/>
@@ -538,13 +524,77 @@
                 <w:rFonts w:ascii="Courier New" w:cs="Courier New" w:eastAsia="Courier New" w:hAnsi="Courier New"/>
                 <w:color w:val="333333"/>
               </w:rPr>
+              <w:t xml:space="preserve">prompts/api_09</w:t>
+            </w:r>
+            <w:r>
+              <w:rPr>
+                <w:rFonts w:ascii="Arial" w:cs="Arial" w:eastAsia="Arial" w:hAnsi="Arial"/>
+                <w:color w:val="333333"/>
+              </w:rPr>
+              <w:t xml:space="preserve"> … </w:t>
+            </w:r>
+            <w:r>
+              <w:rPr>
+                <w:rFonts w:ascii="Courier New" w:cs="Courier New" w:eastAsia="Courier New" w:hAnsi="Courier New"/>
+                <w:color w:val="333333"/>
+              </w:rPr>
+              <w:t xml:space="preserve">api_14</w:t>
+            </w:r>
+          </w:p>
+        </w:tc>
+        <w:tc>
+          <w:tcPr>
+            <w:tcW w:type="dxa" w:w="7976"/>
+            <w:shd w:fill="FFFFFF" w:val="clear"/>
+            <w:tcMar>
+              <w:top w:type="dxa" w:w="60"/>
+              <w:left w:type="dxa" w:w="120"/>
+              <w:bottom w:type="dxa" w:w="60"/>
+              <w:right w:type="dxa" w:w="120"/>
+            </w:tcMar>
+          </w:tcPr>
+          <w:p>
+            <w:pPr>
+              <w:spacing w:after="60" w:before="60"/>
+            </w:pPr>
+            <w:r>
+              <w:rPr>
+                <w:rFonts w:ascii="Arial" w:cs="Arial" w:eastAsia="Arial" w:hAnsi="Arial"/>
+                <w:color w:val="333333"/>
+              </w:rPr>
+              <w:t xml:space="preserve">Módulo 5: el plan del día, cuatro ideas de funcionalidades y la revisión de calidad</w:t>
+            </w:r>
+          </w:p>
+        </w:tc>
+      </w:tr>
+      <w:tr>
+        <w:tc>
+          <w:tcPr>
+            <w:tcW w:type="dxa" w:w="1024"/>
+            <w:shd w:fill="FFFFFF" w:val="clear"/>
+            <w:tcMar>
+              <w:top w:type="dxa" w:w="60"/>
+              <w:left w:type="dxa" w:w="120"/>
+              <w:bottom w:type="dxa" w:w="60"/>
+              <w:right w:type="dxa" w:w="120"/>
+            </w:tcMar>
+          </w:tcPr>
+          <w:p>
+            <w:pPr>
+              <w:spacing w:after="60" w:before="60"/>
+            </w:pPr>
+            <w:r>
+              <w:rPr>
+                <w:rFonts w:ascii="Courier New" w:cs="Courier New" w:eastAsia="Courier New" w:hAnsi="Courier New"/>
+                <w:color w:val="333333"/>
+              </w:rPr>
               <w:t xml:space="preserve">.agents/skills/</w:t>
             </w:r>
           </w:p>
         </w:tc>
         <w:tc>
           <w:tcPr>
-            <w:tcW w:type="dxa" w:w="8144"/>
+            <w:tcW w:type="dxa" w:w="7976"/>
             <w:shd w:fill="FFFFFF" w:val="clear"/>
             <w:tcMar>
               <w:top w:type="dxa" w:w="60"/>

</xml_diff>

<commit_message>
PRD en un solo prompt, con 2 funcionalidades y sin user stories
- api_07: un prompt con la skill prd-development (y wk-api-nomina para los
  datos), sin preguntas, exactamente 2 funcionalidades. Guarda docs/prd.md.
- api_08: «Lee la funcionalidad número [1] de docs/prd.md».
- api_09: el plan del Módulo 5 es la funcionalidad que falta del PRD y
  1 o 2 de las ideas 10-13.

Co-Authored-By: Claude Opus 5.5 <noreply@anthropic.com>
</commit_message>
<xml_diff>
--- a/LEEME.docx
+++ b/LEEME.docx
@@ -498,7 +498,21 @@
                 <w:rFonts w:ascii="Arial" w:cs="Arial" w:eastAsia="Arial" w:hAnsi="Arial"/>
                 <w:color w:val="333333"/>
               </w:rPr>
-              <w:t xml:space="preserve">Copilot ve su aplicación (MCP), su PRD con las skills y sus funcionalidades</w:t>
+              <w:t xml:space="preserve">Copilot ve su aplicación (MCP), su PRD (con la skill </w:t>
+            </w:r>
+            <w:r>
+              <w:rPr>
+                <w:rFonts w:ascii="Courier New" w:cs="Courier New" w:eastAsia="Courier New" w:hAnsi="Courier New"/>
+                <w:color w:val="333333"/>
+              </w:rPr>
+              <w:t xml:space="preserve">prd-development</w:t>
+            </w:r>
+            <w:r>
+              <w:rPr>
+                <w:rFonts w:ascii="Arial" w:cs="Arial" w:eastAsia="Arial" w:hAnsi="Arial"/>
+                <w:color w:val="333333"/>
+              </w:rPr>
+              <w:t xml:space="preserve">) y su primera funcionalidad</w:t>
             </w:r>
           </w:p>
         </w:tc>

</xml_diff>

<commit_message>
Skill wk-api-a3doc (gestor documental), de la documentación oficial
Login propio, todo POST con el token en el cuerpo, errorCode dentro de la respuesta,
páginas desde 0 y máximo 100. Métodos de lectura con sus campos, códigos de error y
atributos de los documentos. Los métodos que escriben quedan fuera.

Co-Authored-By: Claude Opus 5.5 <noreply@anthropic.com>
</commit_message>
<xml_diff>
--- a/LEEME.docx
+++ b/LEEME.docx
@@ -208,8 +208,8 @@
         </w:tblBorders>
       </w:tblPr>
       <w:tblGrid>
-        <w:gridCol w:w="856"/>
-        <w:gridCol w:w="8144"/>
+        <w:gridCol w:w="810"/>
+        <w:gridCol w:w="8190"/>
       </w:tblGrid>
       <w:tr>
         <w:trPr>
@@ -217,7 +217,7 @@
         </w:trPr>
         <w:tc>
           <w:tcPr>
-            <w:tcW w:type="dxa" w:w="856"/>
+            <w:tcW w:type="dxa" w:w="810"/>
             <w:shd w:fill="020857" w:val="clear"/>
             <w:tcMar>
               <w:top w:type="dxa" w:w="60"/>
@@ -243,7 +243,7 @@
         </w:tc>
         <w:tc>
           <w:tcPr>
-            <w:tcW w:type="dxa" w:w="8144"/>
+            <w:tcW w:type="dxa" w:w="8190"/>
             <w:shd w:fill="020857" w:val="clear"/>
             <w:tcMar>
               <w:top w:type="dxa" w:w="60"/>
@@ -271,7 +271,7 @@
       <w:tr>
         <w:tc>
           <w:tcPr>
-            <w:tcW w:type="dxa" w:w="856"/>
+            <w:tcW w:type="dxa" w:w="810"/>
             <w:shd w:fill="FFFFFF" w:val="clear"/>
             <w:tcMar>
               <w:top w:type="dxa" w:w="60"/>
@@ -295,7 +295,7 @@
         </w:tc>
         <w:tc>
           <w:tcPr>
-            <w:tcW w:type="dxa" w:w="8144"/>
+            <w:tcW w:type="dxa" w:w="8190"/>
             <w:shd w:fill="FFFFFF" w:val="clear"/>
             <w:tcMar>
               <w:top w:type="dxa" w:w="60"/>
@@ -328,7 +328,7 @@
       <w:tr>
         <w:tc>
           <w:tcPr>
-            <w:tcW w:type="dxa" w:w="856"/>
+            <w:tcW w:type="dxa" w:w="810"/>
             <w:shd w:fill="FFFFFF" w:val="clear"/>
             <w:tcMar>
               <w:top w:type="dxa" w:w="60"/>
@@ -366,7 +366,7 @@
         </w:tc>
         <w:tc>
           <w:tcPr>
-            <w:tcW w:type="dxa" w:w="8144"/>
+            <w:tcW w:type="dxa" w:w="8190"/>
             <w:shd w:fill="FFFFFF" w:val="clear"/>
             <w:tcMar>
               <w:top w:type="dxa" w:w="60"/>
@@ -392,7 +392,7 @@
       <w:tr>
         <w:tc>
           <w:tcPr>
-            <w:tcW w:type="dxa" w:w="856"/>
+            <w:tcW w:type="dxa" w:w="810"/>
             <w:shd w:fill="FFFFFF" w:val="clear"/>
             <w:tcMar>
               <w:top w:type="dxa" w:w="60"/>
@@ -430,7 +430,7 @@
         </w:tc>
         <w:tc>
           <w:tcPr>
-            <w:tcW w:type="dxa" w:w="8144"/>
+            <w:tcW w:type="dxa" w:w="8190"/>
             <w:shd w:fill="FFFFFF" w:val="clear"/>
             <w:tcMar>
               <w:top w:type="dxa" w:w="60"/>
@@ -456,7 +456,7 @@
       <w:tr>
         <w:tc>
           <w:tcPr>
-            <w:tcW w:type="dxa" w:w="856"/>
+            <w:tcW w:type="dxa" w:w="810"/>
             <w:shd w:fill="FFFFFF" w:val="clear"/>
             <w:tcMar>
               <w:top w:type="dxa" w:w="60"/>
@@ -494,7 +494,7 @@
         </w:tc>
         <w:tc>
           <w:tcPr>
-            <w:tcW w:type="dxa" w:w="8144"/>
+            <w:tcW w:type="dxa" w:w="8190"/>
             <w:shd w:fill="FFFFFF" w:val="clear"/>
             <w:tcMar>
               <w:top w:type="dxa" w:w="60"/>
@@ -520,7 +520,7 @@
       <w:tr>
         <w:tc>
           <w:tcPr>
-            <w:tcW w:type="dxa" w:w="856"/>
+            <w:tcW w:type="dxa" w:w="810"/>
             <w:shd w:fill="FFFFFF" w:val="clear"/>
             <w:tcMar>
               <w:top w:type="dxa" w:w="60"/>
@@ -544,7 +544,7 @@
         </w:tc>
         <w:tc>
           <w:tcPr>
-            <w:tcW w:type="dxa" w:w="8144"/>
+            <w:tcW w:type="dxa" w:w="8190"/>
             <w:shd w:fill="FFFFFF" w:val="clear"/>
             <w:tcMar>
               <w:top w:type="dxa" w:w="60"/>
@@ -674,6 +674,20 @@
                 <w:rFonts w:ascii="Arial" w:cs="Arial" w:eastAsia="Arial" w:hAnsi="Arial"/>
                 <w:color w:val="333333"/>
               </w:rPr>
+              <w:t xml:space="preserve">, </w:t>
+            </w:r>
+            <w:r>
+              <w:rPr>
+                <w:rFonts w:ascii="Courier New" w:cs="Courier New" w:eastAsia="Courier New" w:hAnsi="Courier New"/>
+                <w:color w:val="333333"/>
+              </w:rPr>
+              <w:t xml:space="preserve">wk-api-contabilidad</w:t>
+            </w:r>
+            <w:r>
+              <w:rPr>
+                <w:rFonts w:ascii="Arial" w:cs="Arial" w:eastAsia="Arial" w:hAnsi="Arial"/>
+                <w:color w:val="333333"/>
+              </w:rPr>
               <w:t xml:space="preserve"> y </w:t>
             </w:r>
             <w:r>
@@ -681,7 +695,7 @@
                 <w:rFonts w:ascii="Courier New" w:cs="Courier New" w:eastAsia="Courier New" w:hAnsi="Courier New"/>
                 <w:color w:val="333333"/>
               </w:rPr>
-              <w:t xml:space="preserve">wk-api-contabilidad</w:t>
+              <w:t xml:space="preserve">wk-api-a3doc</w:t>
             </w:r>
           </w:p>
         </w:tc>

</xml_diff>

<commit_message>
a3doc probada y GUIA-A3DOC.md para construir libre en el Módulo 5
Co-Authored-By: Claude Opus 5.5 <noreply@anthropic.com>
</commit_message>
<xml_diff>
--- a/LEEME.docx
+++ b/LEEME.docx
@@ -513,6 +513,56 @@
                 <w:color w:val="333333"/>
               </w:rPr>
               <w:t xml:space="preserve">Módulo 5: el plan del día, cuatro ideas de funcionalidades y la revisión de calidad</w:t>
+            </w:r>
+          </w:p>
+        </w:tc>
+      </w:tr>
+      <w:tr>
+        <w:tc>
+          <w:tcPr>
+            <w:tcW w:type="dxa" w:w="810"/>
+            <w:shd w:fill="FFFFFF" w:val="clear"/>
+            <w:tcMar>
+              <w:top w:type="dxa" w:w="60"/>
+              <w:left w:type="dxa" w:w="120"/>
+              <w:bottom w:type="dxa" w:w="60"/>
+              <w:right w:type="dxa" w:w="120"/>
+            </w:tcMar>
+          </w:tcPr>
+          <w:p>
+            <w:pPr>
+              <w:spacing w:after="60" w:before="60"/>
+            </w:pPr>
+            <w:r>
+              <w:rPr>
+                <w:rFonts w:ascii="Courier New" w:cs="Courier New" w:eastAsia="Courier New" w:hAnsi="Courier New"/>
+                <w:color w:val="333333"/>
+              </w:rPr>
+              <w:t xml:space="preserve">GUIA-A3DOC.md</w:t>
+            </w:r>
+          </w:p>
+        </w:tc>
+        <w:tc>
+          <w:tcPr>
+            <w:tcW w:type="dxa" w:w="8190"/>
+            <w:shd w:fill="FFFFFF" w:val="clear"/>
+            <w:tcMar>
+              <w:top w:type="dxa" w:w="60"/>
+              <w:left w:type="dxa" w:w="120"/>
+              <w:bottom w:type="dxa" w:w="60"/>
+              <w:right w:type="dxa" w:w="120"/>
+            </w:tcMar>
+          </w:tcPr>
+          <w:p>
+            <w:pPr>
+              <w:spacing w:after="60" w:before="60"/>
+            </w:pPr>
+            <w:r>
+              <w:rPr>
+                <w:rFonts w:ascii="Arial" w:cs="Arial" w:eastAsia="Arial" w:hAnsi="Arial"/>
+                <w:color w:val="333333"/>
+              </w:rPr>
+              <w:t xml:space="preserve">Módulo 5, para quien construya con a3doc (el gestor documental): cómo funciona sin login, el primer prompt, ideas y errores</w:t>
             </w:r>
           </w:p>
         </w:tc>

</xml_diff>